<commit_message>
Add initial document for hire vs DIY comparison
- Created a new Word document outlining the pros and cons of hiring versus doing it yourself.
- Included various sections discussing cost, time, and quality considerations.
</commit_message>
<xml_diff>
--- a/taxes_transfer_risk/notes.docx
+++ b/taxes_transfer_risk/notes.docx
@@ -27,6 +27,12 @@
       </w:pPr>
       <w:r>
         <w:t>Taxes reduce the volatility of returns, thus transferring risk from the investor to the government </w:t>
+      </w:r>
+    </w:p>
+    <w:p/>
+    <w:p>
+      <w:r>
+        <w:t xml:space="preserve">Taxes also are not made lower due to tax loss harvesting. They are just deferred to a later date (assuming the tax laws do not change and assuming your portfolio recovers in value). </w:t>
       </w:r>
     </w:p>
     <w:p/>
@@ -204,6 +210,8 @@
         <w:t xml:space="preserve">It turns out that capital gains tax actually reduces the risk of your portfolio and transfers it to the federal government. </w:t>
       </w:r>
     </w:p>
+    <w:p/>
+    <w:p/>
     <w:sectPr>
       <w:pgSz w:w="12240" w:h="15840"/>
       <w:pgMar w:top="1440" w:right="1440" w:bottom="1440" w:left="1440" w:header="720" w:footer="720" w:gutter="0"/>
@@ -1048,6 +1056,7 @@
   <w:style w:type="character" w:default="1" w:styleId="DefaultParagraphFont">
     <w:name w:val="Default Paragraph Font"/>
     <w:uiPriority w:val="1"/>
+    <w:semiHidden/>
     <w:unhideWhenUsed/>
   </w:style>
   <w:style w:type="table" w:default="1" w:styleId="TableNormal">

</xml_diff>

<commit_message>
Add example tax return spreadsheet and temporary file for Ben Wilson
- Created a new Excel file `return_example.xlsx` in the `taxes_transfer_risk` directory containing example tax return data.
- Added a temporary file `~$return_example.xlsx` with the name "Ben Wilson" for session tracking.
</commit_message>
<xml_diff>
--- a/taxes_transfer_risk/notes.docx
+++ b/taxes_transfer_risk/notes.docx
@@ -4,7 +4,15 @@
   <w:body>
     <w:p>
       <w:r>
-        <w:t>In a taxable investment account the government bears some of the investment risk via taxes </w:t>
+        <w:t xml:space="preserve">In a taxable investment </w:t>
+      </w:r>
+      <w:proofErr w:type="gramStart"/>
+      <w:r>
+        <w:t>account</w:t>
+      </w:r>
+      <w:proofErr w:type="gramEnd"/>
+      <w:r>
+        <w:t xml:space="preserve"> the government bears some of the investment risk via taxes </w:t>
       </w:r>
     </w:p>
     <w:p>
@@ -51,7 +59,15 @@
         </w:numPr>
       </w:pPr>
       <w:r>
-        <w:t xml:space="preserve">Start with an account fully invested in the S&amp;P 500 </w:t>
+        <w:t xml:space="preserve">Start with an account fully invested in </w:t>
+      </w:r>
+      <w:proofErr w:type="gramStart"/>
+      <w:r>
+        <w:t>the S</w:t>
+      </w:r>
+      <w:proofErr w:type="gramEnd"/>
+      <w:r>
+        <w:t xml:space="preserve">&amp;P 500 </w:t>
       </w:r>
     </w:p>
     <w:p>
@@ -105,8 +121,13 @@
     <w:p/>
     <w:p>
       <w:r>
-        <w:t>US Capital Gains tax</w:t>
-      </w:r>
+        <w:t xml:space="preserve">US Capital Gains </w:t>
+      </w:r>
+      <w:proofErr w:type="gramStart"/>
+      <w:r>
+        <w:t>tax</w:t>
+      </w:r>
+      <w:proofErr w:type="gramEnd"/>
     </w:p>
     <w:p>
       <w:pPr>
@@ -195,22 +216,625 @@
         </w:numPr>
       </w:pPr>
       <w:r>
-        <w:t>50 years prior to today</w:t>
+        <w:t>4</w:t>
+      </w:r>
+      <w:r>
+        <w:t>0 years prior to today</w:t>
       </w:r>
     </w:p>
     <w:p/>
     <w:p>
       <w:r>
-        <w:t xml:space="preserve">Most investors are aware of the impact of capital gains tax on the magnitude of returns but few investors probably realize the impact that taxes have on the volatility of returns. </w:t>
+        <w:t xml:space="preserve">Most investors are aware of the impact of capital gains tax on the magnitude of </w:t>
+      </w:r>
+      <w:proofErr w:type="gramStart"/>
+      <w:r>
+        <w:t>returns</w:t>
+      </w:r>
+      <w:proofErr w:type="gramEnd"/>
+      <w:r>
+        <w:t xml:space="preserve"> but few investors probably realize the impact that taxes have on the volatility of returns. </w:t>
       </w:r>
     </w:p>
     <w:p/>
     <w:p>
       <w:r>
-        <w:t xml:space="preserve">It turns out that capital gains tax actually reduces the risk of your portfolio and transfers it to the federal government. </w:t>
+        <w:t xml:space="preserve">It turns out that capital gains tax </w:t>
+      </w:r>
+      <w:proofErr w:type="gramStart"/>
+      <w:r>
+        <w:t>actually reduces</w:t>
+      </w:r>
+      <w:proofErr w:type="gramEnd"/>
+      <w:r>
+        <w:t xml:space="preserve"> the risk of your portfolio and transfers it to the federal government. </w:t>
       </w:r>
     </w:p>
     <w:p/>
+    <w:p>
+      <w:pPr>
+        <w:pStyle w:val="Title"/>
+      </w:pPr>
+      <w:r>
+        <w:t xml:space="preserve">The </w:t>
+      </w:r>
+      <w:r>
+        <w:t>Hidden</w:t>
+      </w:r>
+      <w:r>
+        <w:t xml:space="preserve"> Co-Investor in Your Taxable Account</w:t>
+      </w:r>
+    </w:p>
+    <w:p>
+      <w:pPr>
+        <w:pStyle w:val="Subtitle"/>
+      </w:pPr>
+      <w:r>
+        <w:t>Taxes d</w:t>
+      </w:r>
+      <w:r>
+        <w:t xml:space="preserve">on’t just </w:t>
+      </w:r>
+      <w:r>
+        <w:t xml:space="preserve">lower </w:t>
+      </w:r>
+      <w:r>
+        <w:t>returns;</w:t>
+      </w:r>
+      <w:r>
+        <w:t xml:space="preserve"> </w:t>
+      </w:r>
+      <w:r>
+        <w:t>t</w:t>
+      </w:r>
+      <w:r>
+        <w:t xml:space="preserve">hey </w:t>
+      </w:r>
+      <w:r>
+        <w:t>also change</w:t>
+      </w:r>
+      <w:r>
+        <w:t xml:space="preserve"> who carries the risk</w:t>
+      </w:r>
+      <w:r>
+        <w:t xml:space="preserve"> of investment</w:t>
+      </w:r>
+      <w:r>
+        <w:t>.</w:t>
+      </w:r>
+    </w:p>
+    <w:p/>
+    <w:p>
+      <w:r>
+        <w:lastRenderedPageBreak/>
+        <w:t>Most investors think about taxes in one direction</w:t>
+      </w:r>
+      <w:r>
+        <w:t xml:space="preserve">, </w:t>
+      </w:r>
+      <w:r>
+        <w:t xml:space="preserve">taxes </w:t>
+      </w:r>
+      <w:r>
+        <w:t>reduce returns and therefore reduce the value of a taxable account</w:t>
+      </w:r>
+      <w:r>
+        <w:t>. Sell</w:t>
+      </w:r>
+      <w:r>
+        <w:t>ing</w:t>
+      </w:r>
+      <w:r>
+        <w:t xml:space="preserve"> a stock at a gain</w:t>
+      </w:r>
+      <w:r>
+        <w:t xml:space="preserve"> means</w:t>
+      </w:r>
+      <w:r>
+        <w:t xml:space="preserve"> writ</w:t>
+      </w:r>
+      <w:r>
+        <w:t>ing</w:t>
+      </w:r>
+      <w:r>
+        <w:t xml:space="preserve"> a check to the government</w:t>
+      </w:r>
+      <w:r>
+        <w:t>. While this is the reality of taxable investment accounts, it is also an incomplete picture.</w:t>
+      </w:r>
+    </w:p>
+    <w:p/>
+    <w:p>
+      <w:r>
+        <w:t>There is a second</w:t>
+      </w:r>
+      <w:r>
+        <w:t>ary</w:t>
+      </w:r>
+      <w:r>
+        <w:t xml:space="preserve"> effect </w:t>
+      </w:r>
+      <w:r>
+        <w:t xml:space="preserve">of capital gains tax </w:t>
+      </w:r>
+      <w:r>
+        <w:t>hiding in plain sight</w:t>
+      </w:r>
+      <w:r>
+        <w:t xml:space="preserve">. </w:t>
+      </w:r>
+      <w:r>
+        <w:t xml:space="preserve">In a taxable account, the government is not merely a collector standing at the finish line. In </w:t>
+      </w:r>
+      <w:r>
+        <w:t xml:space="preserve">a very real </w:t>
+      </w:r>
+      <w:proofErr w:type="gramStart"/>
+      <w:r>
+        <w:t>way</w:t>
+      </w:r>
+      <w:proofErr w:type="gramEnd"/>
+      <w:r>
+        <w:t xml:space="preserve"> </w:t>
+      </w:r>
+      <w:r>
+        <w:t>the government is also a silent partner in every investment decision you make.</w:t>
+      </w:r>
+    </w:p>
+    <w:p/>
+    <w:p>
+      <w:r>
+        <w:t>To illustrate the point, let’s do a little analysis. The assumptions for th</w:t>
+      </w:r>
+      <w:r>
+        <w:t xml:space="preserve">e experiment </w:t>
+      </w:r>
+      <w:r>
+        <w:t>are as follows:</w:t>
+      </w:r>
+    </w:p>
+    <w:p>
+      <w:pPr>
+        <w:pStyle w:val="ListParagraph"/>
+        <w:numPr>
+          <w:ilvl w:val="0"/>
+          <w:numId w:val="3"/>
+        </w:numPr>
+      </w:pPr>
+      <w:r>
+        <w:t>There is an initial investment of</w:t>
+      </w:r>
+      <w:r>
+        <w:rPr>
+          <w:b/>
+          <w:bCs/>
+        </w:rPr>
+        <w:t xml:space="preserve"> </w:t>
+      </w:r>
+      <w:r>
+        <w:t>$1,000,000</w:t>
+      </w:r>
+      <w:r>
+        <w:t xml:space="preserve"> in a taxable brokerage account </w:t>
+      </w:r>
+    </w:p>
+    <w:p>
+      <w:pPr>
+        <w:pStyle w:val="ListParagraph"/>
+        <w:numPr>
+          <w:ilvl w:val="0"/>
+          <w:numId w:val="3"/>
+        </w:numPr>
+      </w:pPr>
+      <w:r>
+        <w:t xml:space="preserve">The account is fully invested in </w:t>
+      </w:r>
+      <w:proofErr w:type="gramStart"/>
+      <w:r>
+        <w:t>the</w:t>
+      </w:r>
+      <w:r>
+        <w:t xml:space="preserve"> S</w:t>
+      </w:r>
+      <w:proofErr w:type="gramEnd"/>
+      <w:r>
+        <w:t>&amp;P 500</w:t>
+      </w:r>
+    </w:p>
+    <w:p>
+      <w:pPr>
+        <w:pStyle w:val="ListParagraph"/>
+        <w:numPr>
+          <w:ilvl w:val="0"/>
+          <w:numId w:val="3"/>
+        </w:numPr>
+      </w:pPr>
+      <w:r>
+        <w:t>The account is held for forty years</w:t>
+      </w:r>
+    </w:p>
+    <w:p>
+      <w:pPr>
+        <w:pStyle w:val="ListParagraph"/>
+        <w:numPr>
+          <w:ilvl w:val="0"/>
+          <w:numId w:val="3"/>
+        </w:numPr>
+      </w:pPr>
+      <w:r>
+        <w:t>Dividends are ignored</w:t>
+      </w:r>
+    </w:p>
+    <w:p>
+      <w:pPr>
+        <w:pStyle w:val="ListParagraph"/>
+        <w:numPr>
+          <w:ilvl w:val="0"/>
+          <w:numId w:val="3"/>
+        </w:numPr>
+      </w:pPr>
+      <w:r>
+        <w:t>All gains are realized and taxed at the end of each year</w:t>
+      </w:r>
+    </w:p>
+    <w:p>
+      <w:pPr>
+        <w:pStyle w:val="ListParagraph"/>
+        <w:numPr>
+          <w:ilvl w:val="0"/>
+          <w:numId w:val="3"/>
+        </w:numPr>
+      </w:pPr>
+      <w:r>
+        <w:t>Losses can be carried forward indefinitely and used to offset future gains</w:t>
+      </w:r>
+    </w:p>
+    <w:p>
+      <w:pPr>
+        <w:pStyle w:val="ListParagraph"/>
+        <w:numPr>
+          <w:ilvl w:val="0"/>
+          <w:numId w:val="3"/>
+        </w:numPr>
+      </w:pPr>
+      <w:r>
+        <w:t>Capital Gains tax is a fixed</w:t>
+      </w:r>
+      <w:r>
+        <w:t xml:space="preserve"> 20% </w:t>
+      </w:r>
+      <w:r>
+        <w:t>(regardless of holding period)</w:t>
+      </w:r>
+    </w:p>
+    <w:p>
+      <w:pPr>
+        <w:ind w:left="360"/>
+      </w:pPr>
+    </w:p>
+    <w:p>
+      <w:r>
+        <w:t xml:space="preserve">With these assumptions in place, we can </w:t>
+      </w:r>
+      <w:proofErr w:type="gramStart"/>
+      <w:r>
+        <w:t>actually calculate</w:t>
+      </w:r>
+      <w:proofErr w:type="gramEnd"/>
+      <w:r>
+        <w:t xml:space="preserve"> the impact of taxes on the returns of the investor’s taxable account and compare them to the tax-free returns that the S&amp;P 500 produced. </w:t>
+      </w:r>
+    </w:p>
+    <w:p/>
+    <w:p>
+      <w:r>
+        <w:t>LINK TO TABLE</w:t>
+      </w:r>
+    </w:p>
+    <w:p/>
+    <w:p>
+      <w:r>
+        <w:t>What is immediately obvious is that</w:t>
+      </w:r>
+      <w:r>
+        <w:t xml:space="preserve"> taxes reduce the magnitude of positive returns</w:t>
+      </w:r>
+      <w:r>
+        <w:t xml:space="preserve">. </w:t>
+      </w:r>
+      <w:r>
+        <w:t xml:space="preserve">After taxes </w:t>
+      </w:r>
+      <w:r>
+        <w:t xml:space="preserve">the investor keeps less of that year’s gain. </w:t>
+      </w:r>
+      <w:r>
+        <w:t xml:space="preserve">However, losses are not taxed and can be used to offset gains in future periods. </w:t>
+      </w:r>
+    </w:p>
+    <w:p/>
+    <w:p>
+      <w:r>
+        <w:t xml:space="preserve">And this </w:t>
+      </w:r>
+      <w:r>
+        <w:t xml:space="preserve">is where the story gets more interesting. </w:t>
+      </w:r>
+      <w:r>
+        <w:t>T</w:t>
+      </w:r>
+      <w:r>
+        <w:t>axes reduce the upside</w:t>
+      </w:r>
+      <w:r>
+        <w:t xml:space="preserve"> and do not apply to the </w:t>
+      </w:r>
+      <w:r>
+        <w:t>downside. A gain</w:t>
+      </w:r>
+      <w:r>
+        <w:t xml:space="preserve"> is</w:t>
+      </w:r>
+      <w:r>
+        <w:t xml:space="preserve"> shared with the government</w:t>
+      </w:r>
+      <w:r>
+        <w:t xml:space="preserve"> and realized</w:t>
+      </w:r>
+      <w:r>
+        <w:t xml:space="preserve"> loss</w:t>
+      </w:r>
+      <w:r>
+        <w:t>es</w:t>
+      </w:r>
+      <w:r>
+        <w:t xml:space="preserve"> create a benefit</w:t>
+      </w:r>
+      <w:r>
+        <w:t xml:space="preserve"> to the investor, reducing taxes in later years</w:t>
+      </w:r>
+      <w:r>
+        <w:t xml:space="preserve">. </w:t>
+      </w:r>
+      <w:r>
+        <w:t>In short; t</w:t>
+      </w:r>
+      <w:r>
+        <w:t>he investor does n</w:t>
+      </w:r>
+      <w:r>
+        <w:t>ot bear as much risk when taxed</w:t>
+      </w:r>
+      <w:r>
+        <w:t>.</w:t>
+      </w:r>
+      <w:r>
+        <w:t xml:space="preserve"> This result may be more digestible in a visualization:</w:t>
+      </w:r>
+    </w:p>
+    <w:p/>
+    <w:p>
+      <w:r>
+        <w:lastRenderedPageBreak/>
+        <w:drawing>
+          <wp:anchor distT="0" distB="0" distL="114300" distR="114300" simplePos="0" relativeHeight="251658240" behindDoc="1" locked="0" layoutInCell="1" allowOverlap="1" wp14:anchorId="7C2C471F" wp14:editId="00080D34">
+            <wp:simplePos x="0" y="0"/>
+            <wp:positionH relativeFrom="margin">
+              <wp:posOffset>3619500</wp:posOffset>
+            </wp:positionH>
+            <wp:positionV relativeFrom="paragraph">
+              <wp:posOffset>0</wp:posOffset>
+            </wp:positionV>
+            <wp:extent cx="2139315" cy="2139315"/>
+            <wp:effectExtent l="0" t="0" r="0" b="0"/>
+            <wp:wrapTight wrapText="bothSides">
+              <wp:wrapPolygon edited="0">
+                <wp:start x="0" y="0"/>
+                <wp:lineTo x="0" y="21350"/>
+                <wp:lineTo x="21350" y="21350"/>
+                <wp:lineTo x="21350" y="0"/>
+                <wp:lineTo x="0" y="0"/>
+              </wp:wrapPolygon>
+            </wp:wrapTight>
+            <wp:docPr id="58444148" name="Picture 1"/>
+            <wp:cNvGraphicFramePr>
+              <a:graphicFrameLocks xmlns:a="http://schemas.openxmlformats.org/drawingml/2006/main" noChangeAspect="1"/>
+            </wp:cNvGraphicFramePr>
+            <a:graphic xmlns:a="http://schemas.openxmlformats.org/drawingml/2006/main">
+              <a:graphicData uri="http://schemas.openxmlformats.org/drawingml/2006/picture">
+                <pic:pic xmlns:pic="http://schemas.openxmlformats.org/drawingml/2006/picture">
+                  <pic:nvPicPr>
+                    <pic:cNvPr id="58444148" name="Picture 1"/>
+                    <pic:cNvPicPr/>
+                  </pic:nvPicPr>
+                  <pic:blipFill>
+                    <a:blip r:embed="rId5" cstate="print">
+                      <a:extLst>
+                        <a:ext uri="{28A0092B-C50C-407E-A947-70E740481C1C}">
+                          <a14:useLocalDpi xmlns:a14="http://schemas.microsoft.com/office/drawing/2010/main" val="0"/>
+                        </a:ext>
+                      </a:extLst>
+                    </a:blip>
+                    <a:stretch>
+                      <a:fillRect/>
+                    </a:stretch>
+                  </pic:blipFill>
+                  <pic:spPr>
+                    <a:xfrm>
+                      <a:off x="0" y="0"/>
+                      <a:ext cx="2139315" cy="2139315"/>
+                    </a:xfrm>
+                    <a:prstGeom prst="rect">
+                      <a:avLst/>
+                    </a:prstGeom>
+                  </pic:spPr>
+                </pic:pic>
+              </a:graphicData>
+            </a:graphic>
+            <wp14:sizeRelH relativeFrom="margin">
+              <wp14:pctWidth>0</wp14:pctWidth>
+            </wp14:sizeRelH>
+            <wp14:sizeRelV relativeFrom="margin">
+              <wp14:pctHeight>0</wp14:pctHeight>
+            </wp14:sizeRelV>
+          </wp:anchor>
+        </w:drawing>
+      </w:r>
+      <w:r>
+        <w:drawing>
+          <wp:anchor distT="0" distB="0" distL="114300" distR="114300" simplePos="0" relativeHeight="251659264" behindDoc="1" locked="0" layoutInCell="1" allowOverlap="1" wp14:anchorId="5A5A0B92" wp14:editId="779A930B">
+            <wp:simplePos x="0" y="0"/>
+            <wp:positionH relativeFrom="column">
+              <wp:posOffset>0</wp:posOffset>
+            </wp:positionH>
+            <wp:positionV relativeFrom="paragraph">
+              <wp:posOffset>0</wp:posOffset>
+            </wp:positionV>
+            <wp:extent cx="3587750" cy="2139315"/>
+            <wp:effectExtent l="0" t="0" r="0" b="0"/>
+            <wp:wrapTight wrapText="bothSides">
+              <wp:wrapPolygon edited="0">
+                <wp:start x="0" y="0"/>
+                <wp:lineTo x="0" y="21350"/>
+                <wp:lineTo x="21447" y="21350"/>
+                <wp:lineTo x="21447" y="0"/>
+                <wp:lineTo x="0" y="0"/>
+              </wp:wrapPolygon>
+            </wp:wrapTight>
+            <wp:docPr id="910206394" name="Picture 1"/>
+            <wp:cNvGraphicFramePr>
+              <a:graphicFrameLocks xmlns:a="http://schemas.openxmlformats.org/drawingml/2006/main" noChangeAspect="1"/>
+            </wp:cNvGraphicFramePr>
+            <a:graphic xmlns:a="http://schemas.openxmlformats.org/drawingml/2006/main">
+              <a:graphicData uri="http://schemas.openxmlformats.org/drawingml/2006/picture">
+                <pic:pic xmlns:pic="http://schemas.openxmlformats.org/drawingml/2006/picture">
+                  <pic:nvPicPr>
+                    <pic:cNvPr id="910206394" name="Picture 1"/>
+                    <pic:cNvPicPr/>
+                  </pic:nvPicPr>
+                  <pic:blipFill>
+                    <a:blip r:embed="rId6" cstate="print">
+                      <a:extLst>
+                        <a:ext uri="{28A0092B-C50C-407E-A947-70E740481C1C}">
+                          <a14:useLocalDpi xmlns:a14="http://schemas.microsoft.com/office/drawing/2010/main" val="0"/>
+                        </a:ext>
+                      </a:extLst>
+                    </a:blip>
+                    <a:stretch>
+                      <a:fillRect/>
+                    </a:stretch>
+                  </pic:blipFill>
+                  <pic:spPr>
+                    <a:xfrm>
+                      <a:off x="0" y="0"/>
+                      <a:ext cx="3587750" cy="2139315"/>
+                    </a:xfrm>
+                    <a:prstGeom prst="rect">
+                      <a:avLst/>
+                    </a:prstGeom>
+                  </pic:spPr>
+                </pic:pic>
+              </a:graphicData>
+            </a:graphic>
+          </wp:anchor>
+        </w:drawing>
+      </w:r>
+    </w:p>
+    <w:p>
+      <w:r>
+        <w:t>The chart</w:t>
+      </w:r>
+      <w:r>
+        <w:t>s</w:t>
+      </w:r>
+      <w:r>
+        <w:t xml:space="preserve"> above show the pretax and post-tax return distributions generated by a Monte Carlo simulation trained on the data used to produce the initial analysis. What is important to not</w:t>
+      </w:r>
+      <w:r>
+        <w:t>e</w:t>
+      </w:r>
+      <w:r>
+        <w:t xml:space="preserve"> about this chart is that the standard deviation of the post-tax distribution is lower than the standard deviation of the pre-tax distribution. The standard deviation of a return series is the preferred measure of risk for many investors, and capital gains tax consistently reduces it for taxable accounts. </w:t>
+      </w:r>
+      <w:r>
+        <w:t>Although t</w:t>
+      </w:r>
+      <w:r>
+        <w:t xml:space="preserve">he highs are </w:t>
+      </w:r>
+      <w:r>
+        <w:t>reduced, t</w:t>
+      </w:r>
+      <w:r>
+        <w:t xml:space="preserve">he lows are </w:t>
+      </w:r>
+      <w:r>
+        <w:t xml:space="preserve">also </w:t>
+      </w:r>
+      <w:r>
+        <w:t xml:space="preserve">cushioned. The government takes </w:t>
+      </w:r>
+      <w:r>
+        <w:t>a share of</w:t>
+      </w:r>
+      <w:r>
+        <w:t xml:space="preserve"> the </w:t>
+      </w:r>
+      <w:r>
+        <w:t>reward,</w:t>
+      </w:r>
+      <w:r>
+        <w:t xml:space="preserve"> and</w:t>
+      </w:r>
+      <w:r>
+        <w:t xml:space="preserve"> it</w:t>
+      </w:r>
+      <w:r>
+        <w:t xml:space="preserve"> </w:t>
+      </w:r>
+      <w:r>
+        <w:t>absorbs part of the risk.</w:t>
+      </w:r>
+    </w:p>
+    <w:p/>
+    <w:p>
+      <w:r>
+        <w:t>This does not make taxes good</w:t>
+      </w:r>
+      <w:r>
+        <w:t>, and i</w:t>
+      </w:r>
+      <w:r>
+        <w:t>t does not mean</w:t>
+      </w:r>
+      <w:r>
+        <w:t xml:space="preserve"> that</w:t>
+      </w:r>
+      <w:r>
+        <w:t xml:space="preserve"> investors should realize gains unnecessarily, ignore tax-efficient </w:t>
+      </w:r>
+      <w:r>
+        <w:t>investments, or allocate more to taxable accounts</w:t>
+      </w:r>
+      <w:r>
+        <w:t xml:space="preserve">. The point is </w:t>
+      </w:r>
+      <w:r>
+        <w:t>more subtle;</w:t>
+      </w:r>
+      <w:r>
+        <w:t xml:space="preserve"> taxes change the shape of investment outcomes, not just their size.</w:t>
+      </w:r>
+    </w:p>
+    <w:p/>
+    <w:p>
+      <w:r>
+        <w:t xml:space="preserve">For anyone managing a taxable portfolio, that distinction matters. The tax system is not just a drag on returns. It is also a risk-sharing mechanism. </w:t>
+      </w:r>
+      <w:r>
+        <w:t xml:space="preserve">And taxable accounts should be managed with this knowledge in mind. </w:t>
+      </w:r>
+    </w:p>
     <w:p/>
     <w:sectPr>
       <w:pgSz w:w="12240" w:h="15840"/>
@@ -449,11 +1073,103 @@
       </w:rPr>
     </w:lvl>
   </w:abstractNum>
+  <w:abstractNum w:abstractNumId="2" w15:restartNumberingAfterBreak="0">
+    <w:nsid w:val="646420D0"/>
+    <w:multiLevelType w:val="hybridMultilevel"/>
+    <w:tmpl w:val="89481F10"/>
+    <w:lvl w:ilvl="0" w:tplc="0409000F">
+      <w:start w:val="1"/>
+      <w:numFmt w:val="decimal"/>
+      <w:lvlText w:val="%1."/>
+      <w:lvlJc w:val="left"/>
+      <w:pPr>
+        <w:ind w:left="720" w:hanging="360"/>
+      </w:pPr>
+      <w:rPr>
+        <w:rFonts w:hint="default"/>
+      </w:rPr>
+    </w:lvl>
+    <w:lvl w:ilvl="1" w:tplc="04090019" w:tentative="1">
+      <w:start w:val="1"/>
+      <w:numFmt w:val="lowerLetter"/>
+      <w:lvlText w:val="%2."/>
+      <w:lvlJc w:val="left"/>
+      <w:pPr>
+        <w:ind w:left="1440" w:hanging="360"/>
+      </w:pPr>
+    </w:lvl>
+    <w:lvl w:ilvl="2" w:tplc="0409001B" w:tentative="1">
+      <w:start w:val="1"/>
+      <w:numFmt w:val="lowerRoman"/>
+      <w:lvlText w:val="%3."/>
+      <w:lvlJc w:val="right"/>
+      <w:pPr>
+        <w:ind w:left="2160" w:hanging="180"/>
+      </w:pPr>
+    </w:lvl>
+    <w:lvl w:ilvl="3" w:tplc="0409000F" w:tentative="1">
+      <w:start w:val="1"/>
+      <w:numFmt w:val="decimal"/>
+      <w:lvlText w:val="%4."/>
+      <w:lvlJc w:val="left"/>
+      <w:pPr>
+        <w:ind w:left="2880" w:hanging="360"/>
+      </w:pPr>
+    </w:lvl>
+    <w:lvl w:ilvl="4" w:tplc="04090019" w:tentative="1">
+      <w:start w:val="1"/>
+      <w:numFmt w:val="lowerLetter"/>
+      <w:lvlText w:val="%5."/>
+      <w:lvlJc w:val="left"/>
+      <w:pPr>
+        <w:ind w:left="3600" w:hanging="360"/>
+      </w:pPr>
+    </w:lvl>
+    <w:lvl w:ilvl="5" w:tplc="0409001B" w:tentative="1">
+      <w:start w:val="1"/>
+      <w:numFmt w:val="lowerRoman"/>
+      <w:lvlText w:val="%6."/>
+      <w:lvlJc w:val="right"/>
+      <w:pPr>
+        <w:ind w:left="4320" w:hanging="180"/>
+      </w:pPr>
+    </w:lvl>
+    <w:lvl w:ilvl="6" w:tplc="0409000F" w:tentative="1">
+      <w:start w:val="1"/>
+      <w:numFmt w:val="decimal"/>
+      <w:lvlText w:val="%7."/>
+      <w:lvlJc w:val="left"/>
+      <w:pPr>
+        <w:ind w:left="5040" w:hanging="360"/>
+      </w:pPr>
+    </w:lvl>
+    <w:lvl w:ilvl="7" w:tplc="04090019" w:tentative="1">
+      <w:start w:val="1"/>
+      <w:numFmt w:val="lowerLetter"/>
+      <w:lvlText w:val="%8."/>
+      <w:lvlJc w:val="left"/>
+      <w:pPr>
+        <w:ind w:left="5760" w:hanging="360"/>
+      </w:pPr>
+    </w:lvl>
+    <w:lvl w:ilvl="8" w:tplc="0409001B" w:tentative="1">
+      <w:start w:val="1"/>
+      <w:numFmt w:val="lowerRoman"/>
+      <w:lvlText w:val="%9."/>
+      <w:lvlJc w:val="right"/>
+      <w:pPr>
+        <w:ind w:left="6480" w:hanging="180"/>
+      </w:pPr>
+    </w:lvl>
+  </w:abstractNum>
   <w:num w:numId="1" w16cid:durableId="1523593307">
     <w:abstractNumId w:val="0"/>
   </w:num>
   <w:num w:numId="2" w16cid:durableId="664817087">
     <w:abstractNumId w:val="1"/>
+  </w:num>
+  <w:num w:numId="3" w16cid:durableId="1438478211">
+    <w:abstractNumId w:val="2"/>
   </w:num>
 </w:numbering>
 </file>
@@ -1056,7 +1772,6 @@
   <w:style w:type="character" w:default="1" w:styleId="DefaultParagraphFont">
     <w:name w:val="Default Paragraph Font"/>
     <w:uiPriority w:val="1"/>
-    <w:semiHidden/>
     <w:unhideWhenUsed/>
   </w:style>
   <w:style w:type="table" w:default="1" w:styleId="TableNormal">
@@ -1368,6 +2083,123 @@
       <w:smallCaps/>
       <w:color w:val="0F4761" w:themeColor="accent1" w:themeShade="BF"/>
       <w:spacing w:val="5"/>
+    </w:rPr>
+  </w:style>
+  <w:style w:type="character" w:styleId="BookTitle">
+    <w:name w:val="Book Title"/>
+    <w:basedOn w:val="DefaultParagraphFont"/>
+    <w:uiPriority w:val="33"/>
+    <w:qFormat/>
+    <w:rsid w:val="003E2760"/>
+    <w:rPr>
+      <w:b/>
+      <w:bCs/>
+      <w:i/>
+      <w:iCs/>
+      <w:spacing w:val="5"/>
+    </w:rPr>
+  </w:style>
+  <w:style w:type="paragraph" w:styleId="Caption">
+    <w:name w:val="caption"/>
+    <w:basedOn w:val="Normal"/>
+    <w:next w:val="Normal"/>
+    <w:uiPriority w:val="35"/>
+    <w:semiHidden/>
+    <w:unhideWhenUsed/>
+    <w:qFormat/>
+    <w:rsid w:val="003E2760"/>
+    <w:pPr>
+      <w:spacing w:after="200"/>
+    </w:pPr>
+    <w:rPr>
+      <w:i/>
+      <w:iCs/>
+      <w:color w:val="0E2841" w:themeColor="text2"/>
+      <w:sz w:val="18"/>
+      <w:szCs w:val="18"/>
+    </w:rPr>
+  </w:style>
+  <w:style w:type="character" w:styleId="Emphasis">
+    <w:name w:val="Emphasis"/>
+    <w:basedOn w:val="DefaultParagraphFont"/>
+    <w:uiPriority w:val="20"/>
+    <w:qFormat/>
+    <w:rsid w:val="003E2760"/>
+    <w:rPr>
+      <w:i/>
+      <w:iCs/>
+    </w:rPr>
+  </w:style>
+  <w:style w:type="paragraph" w:styleId="NoSpacing">
+    <w:name w:val="No Spacing"/>
+    <w:uiPriority w:val="1"/>
+    <w:qFormat/>
+    <w:rsid w:val="003E2760"/>
+  </w:style>
+  <w:style w:type="character" w:styleId="Strong">
+    <w:name w:val="Strong"/>
+    <w:basedOn w:val="DefaultParagraphFont"/>
+    <w:uiPriority w:val="22"/>
+    <w:qFormat/>
+    <w:rsid w:val="003E2760"/>
+    <w:rPr>
+      <w:b/>
+      <w:bCs/>
+    </w:rPr>
+  </w:style>
+  <w:style w:type="character" w:styleId="SubtleEmphasis">
+    <w:name w:val="Subtle Emphasis"/>
+    <w:basedOn w:val="DefaultParagraphFont"/>
+    <w:uiPriority w:val="19"/>
+    <w:qFormat/>
+    <w:rsid w:val="003E2760"/>
+    <w:rPr>
+      <w:i/>
+      <w:iCs/>
+      <w:color w:val="404040" w:themeColor="text1" w:themeTint="BF"/>
+    </w:rPr>
+  </w:style>
+  <w:style w:type="character" w:styleId="SubtleReference">
+    <w:name w:val="Subtle Reference"/>
+    <w:basedOn w:val="DefaultParagraphFont"/>
+    <w:uiPriority w:val="31"/>
+    <w:qFormat/>
+    <w:rsid w:val="003E2760"/>
+    <w:rPr>
+      <w:smallCaps/>
+      <w:color w:val="5A5A5A" w:themeColor="text1" w:themeTint="A5"/>
+    </w:rPr>
+  </w:style>
+  <w:style w:type="paragraph" w:styleId="TOCHeading">
+    <w:name w:val="TOC Heading"/>
+    <w:basedOn w:val="Heading1"/>
+    <w:next w:val="Normal"/>
+    <w:uiPriority w:val="39"/>
+    <w:semiHidden/>
+    <w:unhideWhenUsed/>
+    <w:qFormat/>
+    <w:rsid w:val="003E2760"/>
+    <w:pPr>
+      <w:spacing w:before="240" w:after="0"/>
+      <w:outlineLvl w:val="9"/>
+    </w:pPr>
+    <w:rPr>
+      <w:sz w:val="32"/>
+      <w:szCs w:val="32"/>
+    </w:rPr>
+  </w:style>
+  <w:style w:type="paragraph" w:styleId="NormalWeb">
+    <w:name w:val="Normal (Web)"/>
+    <w:basedOn w:val="Normal"/>
+    <w:uiPriority w:val="99"/>
+    <w:semiHidden/>
+    <w:unhideWhenUsed/>
+    <w:rsid w:val="003E2760"/>
+    <w:pPr>
+      <w:spacing w:before="100" w:beforeAutospacing="1" w:after="100" w:afterAutospacing="1"/>
+    </w:pPr>
+    <w:rPr>
+      <w:rFonts w:ascii="Times New Roman" w:hAnsi="Times New Roman" w:cs="Times New Roman"/>
     </w:rPr>
   </w:style>
 </w:styles>

</xml_diff>